<commit_message>
Update Chapter 12 & 13 Testing.docx
</commit_message>
<xml_diff>
--- a/Ch12/Chapter 12 & 13 Testing.docx
+++ b/Ch12/Chapter 12 & 13 Testing.docx
@@ -10,7 +10,7 @@
         <w:t xml:space="preserve">Chapter </w:t>
       </w:r>
       <w:r>
-        <w:t>9</w:t>
+        <w:t>12</w:t>
       </w:r>
       <w:r>
         <w:t xml:space="preserve"> Testing</w:t>
@@ -18,13 +18,7 @@
     </w:p>
     <w:p>
       <w:r>
-        <w:t xml:space="preserve">Link to GitHub and Path for Chapter </w:t>
-      </w:r>
-      <w:r>
-        <w:t>9</w:t>
-      </w:r>
-      <w:r>
-        <w:t xml:space="preserve"> Folder </w:t>
+        <w:t xml:space="preserve">Link to GitHub </w:t>
       </w:r>
     </w:p>
     <w:p>
@@ -33,19 +27,7 @@
           <w:rPr>
             <w:rStyle w:val="Hyperlink"/>
           </w:rPr>
-          <w:t>https://github.com/jocooper31</w:t>
-        </w:r>
-        <w:r>
-          <w:rPr>
-            <w:rStyle w:val="Hyperlink"/>
-          </w:rPr>
-          <w:t>7</w:t>
-        </w:r>
-        <w:r>
-          <w:rPr>
-            <w:rStyle w:val="Hyperlink"/>
-          </w:rPr>
-          <w:t>/SDEV153-WebPage.git</w:t>
+          <w:t>https://github.com/jocooper317/SDEV153-WebPage.git</w:t>
         </w:r>
       </w:hyperlink>
       <w:r>
@@ -56,19 +38,7 @@
           <w:rPr>
             <w:rStyle w:val="Hyperlink"/>
           </w:rPr>
-          <w:t>https://jocooper317.github.io/SDEV153-W</w:t>
-        </w:r>
-        <w:r>
-          <w:rPr>
-            <w:rStyle w:val="Hyperlink"/>
-          </w:rPr>
-          <w:t>e</w:t>
-        </w:r>
-        <w:r>
-          <w:rPr>
-            <w:rStyle w:val="Hyperlink"/>
-          </w:rPr>
-          <w:t>bPage/</w:t>
+          <w:t>https://jocooper317.github.io/SDEV153-WebPage/</w:t>
         </w:r>
       </w:hyperlink>
     </w:p>
@@ -82,7 +52,7 @@
         <w:t xml:space="preserve">Chapter </w:t>
       </w:r>
       <w:r>
-        <w:t>9</w:t>
+        <w:t>12</w:t>
       </w:r>
       <w:r>
         <w:t xml:space="preserve"> CSS W3C Validation – </w:t>
@@ -91,10 +61,10 @@
     <w:p>
       <w:r>
         <w:drawing>
-          <wp:inline distT="0" distB="0" distL="0" distR="0" wp14:anchorId="457113AB" wp14:editId="77784D23">
-            <wp:extent cx="5943600" cy="4808855"/>
-            <wp:effectExtent l="0" t="0" r="0" b="0"/>
-            <wp:docPr id="1646464839" name="Picture 1"/>
+          <wp:inline distT="0" distB="0" distL="0" distR="0" wp14:anchorId="6010670B" wp14:editId="0FED0239">
+            <wp:extent cx="5943600" cy="2147570"/>
+            <wp:effectExtent l="0" t="0" r="0" b="5080"/>
+            <wp:docPr id="1332326350" name="Picture 1"/>
             <wp:cNvGraphicFramePr>
               <a:graphicFrameLocks xmlns:a="http://schemas.openxmlformats.org/drawingml/2006/main" noChangeAspect="1"/>
             </wp:cNvGraphicFramePr>
@@ -102,7 +72,7 @@
               <a:graphicData uri="http://schemas.openxmlformats.org/drawingml/2006/picture">
                 <pic:pic xmlns:pic="http://schemas.openxmlformats.org/drawingml/2006/picture">
                   <pic:nvPicPr>
-                    <pic:cNvPr id="1646464839" name=""/>
+                    <pic:cNvPr id="1332326350" name=""/>
                     <pic:cNvPicPr/>
                   </pic:nvPicPr>
                   <pic:blipFill>
@@ -114,7 +84,7 @@
                   <pic:spPr>
                     <a:xfrm>
                       <a:off x="0" y="0"/>
-                      <a:ext cx="5943600" cy="4808855"/>
+                      <a:ext cx="5943600" cy="2147570"/>
                     </a:xfrm>
                     <a:prstGeom prst="rect">
                       <a:avLst/>
@@ -132,20 +102,24 @@
         <w:t xml:space="preserve">Chapter </w:t>
       </w:r>
       <w:r>
-        <w:t>9</w:t>
-      </w:r>
-      <w:r>
-        <w:t xml:space="preserve"> Yurts.html html validation – </w:t>
-      </w:r>
-    </w:p>
-    <w:p>
-      <w:r>
-        <w:lastRenderedPageBreak/>
+        <w:t>12</w:t>
+      </w:r>
+      <w:r>
+        <w:t xml:space="preserve"> html validation – </w:t>
+      </w:r>
+    </w:p>
+    <w:p>
+      <w:r>
+        <w:t xml:space="preserve">Shopmals.html </w:t>
+      </w:r>
+    </w:p>
+    <w:p>
+      <w:r>
         <w:drawing>
-          <wp:inline distT="0" distB="0" distL="0" distR="0" wp14:anchorId="06562A5B" wp14:editId="6E747867">
-            <wp:extent cx="5943600" cy="2788920"/>
+          <wp:inline distT="0" distB="0" distL="0" distR="0" wp14:anchorId="6C7AB9E1" wp14:editId="79FE6FD9">
+            <wp:extent cx="5943600" cy="1678940"/>
             <wp:effectExtent l="0" t="0" r="0" b="0"/>
-            <wp:docPr id="1577697058" name="Picture 1"/>
+            <wp:docPr id="1569778700" name="Picture 1"/>
             <wp:cNvGraphicFramePr>
               <a:graphicFrameLocks xmlns:a="http://schemas.openxmlformats.org/drawingml/2006/main" noChangeAspect="1"/>
             </wp:cNvGraphicFramePr>
@@ -153,7 +127,7 @@
               <a:graphicData uri="http://schemas.openxmlformats.org/drawingml/2006/picture">
                 <pic:pic xmlns:pic="http://schemas.openxmlformats.org/drawingml/2006/picture">
                   <pic:nvPicPr>
-                    <pic:cNvPr id="1577697058" name=""/>
+                    <pic:cNvPr id="1569778700" name=""/>
                     <pic:cNvPicPr/>
                   </pic:nvPicPr>
                   <pic:blipFill>
@@ -165,7 +139,7 @@
                   <pic:spPr>
                     <a:xfrm>
                       <a:off x="0" y="0"/>
-                      <a:ext cx="5943600" cy="2788920"/>
+                      <a:ext cx="5943600" cy="1678940"/>
                     </a:xfrm>
                     <a:prstGeom prst="rect">
                       <a:avLst/>
@@ -180,16 +154,17 @@
     </w:p>
     <w:p>
       <w:r>
-        <w:t>Chapter 9 – Reservations.html testing</w:t>
-      </w:r>
-    </w:p>
-    <w:p>
-      <w:r>
+        <w:t>Shop.html</w:t>
+      </w:r>
+    </w:p>
+    <w:p>
+      <w:r>
+        <w:lastRenderedPageBreak/>
         <w:drawing>
-          <wp:inline distT="0" distB="0" distL="0" distR="0" wp14:anchorId="1A7BB1CD" wp14:editId="432AC1F6">
-            <wp:extent cx="5943600" cy="3211830"/>
-            <wp:effectExtent l="0" t="0" r="0" b="7620"/>
-            <wp:docPr id="1016461605" name="Picture 1"/>
+          <wp:inline distT="0" distB="0" distL="0" distR="0" wp14:anchorId="7313513E" wp14:editId="3DAB1BD2">
+            <wp:extent cx="5943600" cy="2035810"/>
+            <wp:effectExtent l="0" t="0" r="0" b="2540"/>
+            <wp:docPr id="918806899" name="Picture 1"/>
             <wp:cNvGraphicFramePr>
               <a:graphicFrameLocks xmlns:a="http://schemas.openxmlformats.org/drawingml/2006/main" noChangeAspect="1"/>
             </wp:cNvGraphicFramePr>
@@ -197,7 +172,7 @@
               <a:graphicData uri="http://schemas.openxmlformats.org/drawingml/2006/picture">
                 <pic:pic xmlns:pic="http://schemas.openxmlformats.org/drawingml/2006/picture">
                   <pic:nvPicPr>
-                    <pic:cNvPr id="1016461605" name=""/>
+                    <pic:cNvPr id="918806899" name=""/>
                     <pic:cNvPicPr/>
                   </pic:nvPicPr>
                   <pic:blipFill>
@@ -209,7 +184,7 @@
                   <pic:spPr>
                     <a:xfrm>
                       <a:off x="0" y="0"/>
-                      <a:ext cx="5943600" cy="3211830"/>
+                      <a:ext cx="5943600" cy="2035810"/>
                     </a:xfrm>
                     <a:prstGeom prst="rect">
                       <a:avLst/>
@@ -224,23 +199,16 @@
     </w:p>
     <w:p>
       <w:r>
-        <w:t xml:space="preserve">Yurts.html </w:t>
-      </w:r>
-      <w:r>
-        <w:t xml:space="preserve">pop up </w:t>
-      </w:r>
-      <w:r>
-        <w:t xml:space="preserve">testing – </w:t>
-      </w:r>
-    </w:p>
-    <w:p>
-      <w:r>
-        <w:lastRenderedPageBreak/>
+        <w:t xml:space="preserve">Shop.html verification – </w:t>
+      </w:r>
+    </w:p>
+    <w:p>
+      <w:r>
         <w:drawing>
-          <wp:inline distT="0" distB="0" distL="0" distR="0" wp14:anchorId="73D0D2AD" wp14:editId="0C4A2387">
-            <wp:extent cx="5943600" cy="3535680"/>
-            <wp:effectExtent l="0" t="0" r="0" b="7620"/>
-            <wp:docPr id="585695839" name="Picture 1"/>
+          <wp:inline distT="0" distB="0" distL="0" distR="0" wp14:anchorId="1C680A86" wp14:editId="18C9F2B5">
+            <wp:extent cx="5943600" cy="4236085"/>
+            <wp:effectExtent l="0" t="0" r="0" b="0"/>
+            <wp:docPr id="1802218984" name="Picture 1"/>
             <wp:cNvGraphicFramePr>
               <a:graphicFrameLocks xmlns:a="http://schemas.openxmlformats.org/drawingml/2006/main" noChangeAspect="1"/>
             </wp:cNvGraphicFramePr>
@@ -248,7 +216,7 @@
               <a:graphicData uri="http://schemas.openxmlformats.org/drawingml/2006/picture">
                 <pic:pic xmlns:pic="http://schemas.openxmlformats.org/drawingml/2006/picture">
                   <pic:nvPicPr>
-                    <pic:cNvPr id="585695839" name=""/>
+                    <pic:cNvPr id="1802218984" name=""/>
                     <pic:cNvPicPr/>
                   </pic:nvPicPr>
                   <pic:blipFill>
@@ -260,7 +228,7 @@
                   <pic:spPr>
                     <a:xfrm>
                       <a:off x="0" y="0"/>
-                      <a:ext cx="5943600" cy="3535680"/>
+                      <a:ext cx="5943600" cy="4236085"/>
                     </a:xfrm>
                     <a:prstGeom prst="rect">
                       <a:avLst/>
@@ -275,22 +243,17 @@
     </w:p>
     <w:p>
       <w:r>
-        <w:t xml:space="preserve">Reservations.html testing – </w:t>
-      </w:r>
-    </w:p>
-    <w:p>
-      <w:r>
-        <w:t xml:space="preserve">Filling out fields </w:t>
+        <w:t>ShopMal.html</w:t>
       </w:r>
     </w:p>
     <w:p>
       <w:r>
         <w:lastRenderedPageBreak/>
         <w:drawing>
-          <wp:inline distT="0" distB="0" distL="0" distR="0" wp14:anchorId="22C732F8" wp14:editId="4CACD62E">
-            <wp:extent cx="5943600" cy="4747260"/>
+          <wp:inline distT="0" distB="0" distL="0" distR="0" wp14:anchorId="51681576" wp14:editId="0AF03BF3">
+            <wp:extent cx="5943600" cy="4231640"/>
             <wp:effectExtent l="0" t="0" r="0" b="0"/>
-            <wp:docPr id="1775640142" name="Picture 1"/>
+            <wp:docPr id="1491949731" name="Picture 1"/>
             <wp:cNvGraphicFramePr>
               <a:graphicFrameLocks xmlns:a="http://schemas.openxmlformats.org/drawingml/2006/main" noChangeAspect="1"/>
             </wp:cNvGraphicFramePr>
@@ -298,7 +261,7 @@
               <a:graphicData uri="http://schemas.openxmlformats.org/drawingml/2006/picture">
                 <pic:pic xmlns:pic="http://schemas.openxmlformats.org/drawingml/2006/picture">
                   <pic:nvPicPr>
-                    <pic:cNvPr id="1775640142" name=""/>
+                    <pic:cNvPr id="1491949731" name=""/>
                     <pic:cNvPicPr/>
                   </pic:nvPicPr>
                   <pic:blipFill>
@@ -310,7 +273,7 @@
                   <pic:spPr>
                     <a:xfrm>
                       <a:off x="0" y="0"/>
-                      <a:ext cx="5943600" cy="4747260"/>
+                      <a:ext cx="5943600" cy="4231640"/>
                     </a:xfrm>
                     <a:prstGeom prst="rect">
                       <a:avLst/>
@@ -325,17 +288,17 @@
     </w:p>
     <w:p>
       <w:r>
-        <w:t xml:space="preserve">Submitted – </w:t>
+        <w:t>Shopmal.html cart</w:t>
       </w:r>
     </w:p>
     <w:p>
       <w:r>
         <w:lastRenderedPageBreak/>
         <w:drawing>
-          <wp:inline distT="0" distB="0" distL="0" distR="0" wp14:anchorId="33BCDF44" wp14:editId="046248B4">
-            <wp:extent cx="5943600" cy="3169285"/>
+          <wp:inline distT="0" distB="0" distL="0" distR="0" wp14:anchorId="0C2E9917" wp14:editId="3D7F4E43">
+            <wp:extent cx="5943600" cy="4268470"/>
             <wp:effectExtent l="0" t="0" r="0" b="0"/>
-            <wp:docPr id="1874949145" name="Picture 1"/>
+            <wp:docPr id="428045420" name="Picture 1"/>
             <wp:cNvGraphicFramePr>
               <a:graphicFrameLocks xmlns:a="http://schemas.openxmlformats.org/drawingml/2006/main" noChangeAspect="1"/>
             </wp:cNvGraphicFramePr>
@@ -343,7 +306,7 @@
               <a:graphicData uri="http://schemas.openxmlformats.org/drawingml/2006/picture">
                 <pic:pic xmlns:pic="http://schemas.openxmlformats.org/drawingml/2006/picture">
                   <pic:nvPicPr>
-                    <pic:cNvPr id="1874949145" name=""/>
+                    <pic:cNvPr id="428045420" name=""/>
                     <pic:cNvPicPr/>
                   </pic:nvPicPr>
                   <pic:blipFill>
@@ -355,7 +318,7 @@
                   <pic:spPr>
                     <a:xfrm>
                       <a:off x="0" y="0"/>
-                      <a:ext cx="5943600" cy="3169285"/>
+                      <a:ext cx="5943600" cy="4268470"/>
                     </a:xfrm>
                     <a:prstGeom prst="rect">
                       <a:avLst/>
@@ -463,33 +426,13 @@
   <w:p>
     <w:pPr>
       <w:pStyle w:val="Header"/>
-      <w:rPr>
-        <w:rFonts w:ascii="Times New Roman" w:hAnsi="Times New Roman" w:cs="Times New Roman"/>
-      </w:rPr>
     </w:pPr>
     <w:r>
       <w:rPr>
         <w:rFonts w:ascii="Times New Roman" w:hAnsi="Times New Roman" w:cs="Times New Roman"/>
       </w:rPr>
-      <w:t>4/</w:t>
+      <w:t>5/5/2026</w:t>
     </w:r>
-    <w:r>
-      <w:rPr>
-        <w:rFonts w:ascii="Times New Roman" w:hAnsi="Times New Roman" w:cs="Times New Roman"/>
-      </w:rPr>
-      <w:t>21</w:t>
-    </w:r>
-    <w:r>
-      <w:rPr>
-        <w:rFonts w:ascii="Times New Roman" w:hAnsi="Times New Roman" w:cs="Times New Roman"/>
-      </w:rPr>
-      <w:t>/2026</w:t>
-    </w:r>
-  </w:p>
-  <w:p>
-    <w:pPr>
-      <w:pStyle w:val="Header"/>
-    </w:pPr>
   </w:p>
 </w:hdr>
 </file>

</xml_diff>